<commit_message>
phase-0: freeze product scope — SCOPE.md (features inventory, user journey, plans & limits, ads placements, community boundaries, MCP tools, notifications, manual payment) + mark phase 0 in-progress in plan board
</commit_message>
<xml_diff>
--- a/docs/Awj_Development_and_Launch_Plan.docx
+++ b/docs/Awj_Development_and_Launch_Plan.docx
@@ -826,9 +826,9 @@
                 <w:rFonts w:ascii="Arial" w:hAnsi="Arial" w:eastAsia="Arial"/>
                 <w:sz w:val="18"/>
                 <w:szCs w:val="18"/>
-                <w:color w:val="7F7F7F"/>
+                <w:color w:val="1F5FA8"/>
               </w:rPr>
-              <w:t xml:space="preserve">لم تبدأ</w:t>
+              <w:t xml:space="preserve">قيد التنفيذ</w:t>
             </w:r>
           </w:p>
         </w:tc>
@@ -855,7 +855,7 @@
                 <w:sz w:val="18"/>
                 <w:szCs w:val="18"/>
               </w:rPr>
-              <w:t xml:space="preserve"/>
+              <w:t xml:space="preserve">2026-09-11</w:t>
             </w:r>
           </w:p>
         </w:tc>
@@ -910,7 +910,7 @@
                 <w:szCs w:val="16"/>
                 <w:color w:val="595959"/>
               </w:rPr>
-              <w:t xml:space="preserve"/>
+              <w:t xml:space="preserve">المهام الثماني وبنود DoD منجزة في docs/phase-0/SCOPE.md — بانتظار اعتماد المالك</w:t>
             </w:r>
           </w:p>
         </w:tc>
@@ -4553,7 +4553,7 @@
                 <w:sz w:val="20"/>
                 <w:szCs w:val="20"/>
               </w:rPr>
-              <w:t xml:space="preserve">بطاقة متابعة — المرحلة صفر (الترتيب 01/18):   [ ] لم تبدأ    [ ] قيد التنفيذ    [ ] منجزة</w:t>
+              <w:t xml:space="preserve">بطاقة متابعة — المرحلة صفر (الترتيب 01/18):   [ ] لم تبدأ    [x] قيد التنفيذ    [ ] منجزة</w:t>
             </w:r>
           </w:p>
           <w:p>
@@ -4569,7 +4569,7 @@
                 <w:szCs w:val="18"/>
                 <w:color w:val="404040"/>
               </w:rPr>
-              <w:t xml:space="preserve">تاريخ البدء: ......................   تاريخ الإنجاز: ......................   المنفّذ: ......................</w:t>
+              <w:t xml:space="preserve">تاريخ البدء: 11 سبتمبر 2026   تاريخ الإنجاز: ......................   المنفّذ: Super Z</w:t>
             </w:r>
           </w:p>
         </w:tc>
@@ -4601,7 +4601,7 @@
         <w:bidi w:val="1"/>
       </w:pPr>
       <w:r>
-        <w:t>[ ] كتابة قائمة Features الحالية في ملف واحد وتقسيمها إلى: ضروري للإطلاق / مؤجل / ملغي.</w:t>
+        <w:t>[x] كتابة قائمة Features الحالية في ملف واحد وتقسيمها إلى: ضروري للإطلاق / مؤجل / ملغي.</w:t>
       </w:r>
     </w:p>
     <w:p>
@@ -4611,7 +4611,7 @@
         <w:bidi w:val="1"/>
       </w:pPr>
       <w:r>
-        <w:t>[ ] تعريف رحلة المستخدم من التسجيل حتى الاستخدام اليومي ثم الترقية.</w:t>
+        <w:t>[x] تعريف رحلة المستخدم من التسجيل حتى الاستخدام اليومي ثم الترقية.</w:t>
       </w:r>
     </w:p>
     <w:p>
@@ -4621,7 +4621,7 @@
         <w:bidi w:val="1"/>
       </w:pPr>
       <w:r>
-        <w:t>[ ] تثبيت الخطط الثلاث وحدود كل خطة بشكل أولي.</w:t>
+        <w:t>[x] تثبيت الخطط الثلاث وحدود كل خطة بشكل أولي.</w:t>
       </w:r>
     </w:p>
     <w:p>
@@ -4631,7 +4631,7 @@
         <w:bidi w:val="1"/>
       </w:pPr>
       <w:r>
-        <w:t>[ ] تحديد أماكن الإعلانات المسموح بها للـFree فقط.</w:t>
+        <w:t>[x] تحديد أماكن الإعلانات المسموح بها للـFree فقط.</w:t>
       </w:r>
     </w:p>
     <w:p>
@@ -4641,7 +4641,7 @@
         <w:bidi w:val="1"/>
       </w:pPr>
       <w:r>
-        <w:t>[ ] تحديد ما الذي يعتبر Community وما الذي يعتبر بيانات خاصة.</w:t>
+        <w:t>[x] تحديد ما الذي يعتبر Community وما الذي يعتبر بيانات خاصة.</w:t>
       </w:r>
     </w:p>
     <w:p>
@@ -4651,7 +4651,7 @@
         <w:bidi w:val="1"/>
       </w:pPr>
       <w:r>
-        <w:t>[ ] تحديد أدوات MCP التي ستتاح في Max في النسخة الأولى.</w:t>
+        <w:t>[x] تحديد أدوات MCP التي ستتاح في Max في النسخة الأولى.</w:t>
       </w:r>
     </w:p>
     <w:p>
@@ -4661,7 +4661,7 @@
         <w:bidi w:val="1"/>
       </w:pPr>
       <w:r>
-        <w:t>[ ] تحديد قنوات الإشعارات: In-App + Web Push في الإصدار الأول.</w:t>
+        <w:t>[x] تحديد قنوات الإشعارات: In-App + Web Push في الإصدار الأول.</w:t>
       </w:r>
     </w:p>
     <w:p>
@@ -4671,7 +4671,7 @@
         <w:bidi w:val="1"/>
       </w:pPr>
       <w:r>
-        <w:t>[ ] تحديد طريقة الدفع الأولية يدويًا، ثم ترك باب Payment Gateway مفتوحًا للمستقبل.</w:t>
+        <w:t>[x] تحديد طريقة الدفع الأولية يدويًا، ثم ترك باب Payment Gateway مفتوحًا للمستقبل.</w:t>
       </w:r>
     </w:p>
     <w:p>
@@ -4691,7 +4691,7 @@
         <w:bidi w:val="1"/>
       </w:pPr>
       <w:r>
-        <w:t>[ ] لدينا Scope مغلق للإطلاق وقائمة مؤجلة منفصلة.</w:t>
+        <w:t>[x] لدينا Scope مغلق للإطلاق وقائمة مؤجلة منفصلة.</w:t>
       </w:r>
     </w:p>
     <w:p>
@@ -4701,7 +4701,7 @@
         <w:bidi w:val="1"/>
       </w:pPr>
       <w:r>
-        <w:t>[ ] كل Feature لها مالك تقني/مسار تنفيذ واضح.</w:t>
+        <w:t>[x] كل Feature لها مالك تقني/مسار تنفيذ واضح.</w:t>
       </w:r>
     </w:p>
     <w:p>
@@ -4711,7 +4711,7 @@
         <w:bidi w:val="1"/>
       </w:pPr>
       <w:r>
-        <w:t>[ ] لا توجد أسئلة معمارية كبيرة معلقة تمنع البدء.</w:t>
+        <w:t>[x] لا توجد أسئلة معمارية كبيرة معلقة تمنع البدء.</w:t>
       </w:r>
     </w:p>
     <w:p>

</xml_diff>

<commit_message>
phase-0 complete: owner approved scope (v1.1) with amendments — Community on Turso from day 1 (offload Supabase), images/attachments on Cloudflare R2; mark phase 0 done in board+card; add plan PDF as the canonical marked tasks file
</commit_message>
<xml_diff>
--- a/docs/Awj_Development_and_Launch_Plan.docx
+++ b/docs/Awj_Development_and_Launch_Plan.docx
@@ -826,9 +826,9 @@
                 <w:rFonts w:ascii="Arial" w:hAnsi="Arial" w:eastAsia="Arial"/>
                 <w:sz w:val="18"/>
                 <w:szCs w:val="18"/>
-                <w:color w:val="1F5FA8"/>
+                <w:color w:val="2E7D32"/>
               </w:rPr>
-              <w:t xml:space="preserve">قيد التنفيذ</w:t>
+              <w:t xml:space="preserve">منجزة</w:t>
             </w:r>
           </w:p>
         </w:tc>
@@ -882,7 +882,7 @@
                 <w:sz w:val="18"/>
                 <w:szCs w:val="18"/>
               </w:rPr>
-              <w:t xml:space="preserve"/>
+              <w:t xml:space="preserve">2026-09-11</w:t>
             </w:r>
           </w:p>
         </w:tc>
@@ -910,7 +910,7 @@
                 <w:szCs w:val="16"/>
                 <w:color w:val="595959"/>
               </w:rPr>
-              <w:t xml:space="preserve">المهام الثماني وبنود DoD منجزة في docs/phase-0/SCOPE.md — بانتظار اعتماد المالك</w:t>
+              <w:t xml:space="preserve">اعتمد المالك 11/9 مع تعديلين: المجتمع على Turso + الصور في R2 — SCOPE.md v1.1</w:t>
             </w:r>
           </w:p>
         </w:tc>
@@ -4553,7 +4553,7 @@
                 <w:sz w:val="20"/>
                 <w:szCs w:val="20"/>
               </w:rPr>
-              <w:t xml:space="preserve">بطاقة متابعة — المرحلة صفر (الترتيب 01/18):   [ ] لم تبدأ    [x] قيد التنفيذ    [ ] منجزة</w:t>
+              <w:t xml:space="preserve">بطاقة متابعة — المرحلة صفر (الترتيب 01/18):   [ ] لم تبدأ    [ ] قيد التنفيذ    [x] منجزة</w:t>
             </w:r>
           </w:p>
           <w:p>
@@ -4569,7 +4569,7 @@
                 <w:szCs w:val="18"/>
                 <w:color w:val="404040"/>
               </w:rPr>
-              <w:t xml:space="preserve">تاريخ البدء: 11 سبتمبر 2026   تاريخ الإنجاز: ......................   المنفّذ: Super Z</w:t>
+              <w:t xml:space="preserve">تاريخ البدء: 11 سبتمبر 2026   تاريخ الإنجاز: 11 سبتمبر 2026   المنفّذ: Super Z</w:t>
             </w:r>
           </w:p>
         </w:tc>

</xml_diff>

<commit_message>
phase-1 complete: mark all 16 checklist items done in plan (card + board row 02 green + dates) — evidence: AUDIT.md, DATABASE.md, smoke-test screenshot; regenerate marked tasks PDF (24 pages)
</commit_message>
<xml_diff>
--- a/docs/Awj_Development_and_Launch_Plan.docx
+++ b/docs/Awj_Development_and_Launch_Plan.docx
@@ -983,7 +983,7 @@
               <w:right w:type="dxa" w:w="100"/>
             </w:tcMar>
             <w:vAlign w:val="center"/>
-            <w:shd w:val="clear" w:color="auto" w:fill="FFF3E0"/>
+            <w:shd w:val="clear" w:color="auto" w:fill="E8F5E9"/>
           </w:tcPr>
           <w:p>
             <w:pPr>
@@ -998,9 +998,9 @@
                 <w:bCs/>
                 <w:sz w:val="18"/>
                 <w:szCs w:val="18"/>
-                <w:color w:val="B45F06"/>
+                <w:color w:val="2E7D32"/>
               </w:rPr>
-              <w:t xml:space="preserve">قيد التنفيذ</w:t>
+              <w:t xml:space="preserve">منجزة</w:t>
             </w:r>
           </w:p>
         </w:tc>
@@ -1027,7 +1027,7 @@
                 <w:sz w:val="18"/>
                 <w:szCs w:val="18"/>
               </w:rPr>
-              <w:t xml:space="preserve"/>
+              <w:t xml:space="preserve">2026-09-11</w:t>
             </w:r>
           </w:p>
         </w:tc>
@@ -1054,7 +1054,7 @@
                 <w:sz w:val="18"/>
                 <w:szCs w:val="18"/>
               </w:rPr>
-              <w:t xml:space="preserve"/>
+              <w:t xml:space="preserve">2026-09-11</w:t>
             </w:r>
           </w:p>
         </w:tc>
@@ -1082,7 +1082,7 @@
                 <w:szCs w:val="16"/>
                 <w:color w:val="595959"/>
               </w:rPr>
-              <w:t xml:space="preserve">مادة التدقيق جاهزة من تقرير المراجعة الشامل (كود ميت + فروق README)</w:t>
+              <w:t xml:space="preserve">منجز كاملًا: حذف ~7,700 سطر ميت + 30 حزمة + validators مركزي + README صادق — الأدلة: docs/phase-1</w:t>
             </w:r>
           </w:p>
         </w:tc>
@@ -4770,7 +4770,7 @@
                 <w:sz w:val="20"/>
                 <w:szCs w:val="20"/>
               </w:rPr>
-              <w:t xml:space="preserve">بطاقة متابعة — المرحلة الأولى (الترتيب 02/18):   [ ] لم تبدأ    [ ] قيد التنفيذ    [ ] منجزة</w:t>
+              <w:t xml:space="preserve">بطاقة متابعة — المرحلة الأولى (الترتيب 02/18):   [ ] لم تبدأ    [ ] قيد التنفيذ    [x] منجزة</w:t>
             </w:r>
           </w:p>
           <w:p>
@@ -4786,7 +4786,7 @@
                 <w:szCs w:val="18"/>
                 <w:color w:val="404040"/>
               </w:rPr>
-              <w:t xml:space="preserve">تاريخ البدء: ......................   تاريخ الإنجاز: ......................   المنفّذ: ......................</w:t>
+              <w:t xml:space="preserve">تاريخ البدء: 11 سبتمبر 2026   تاريخ الإنجاز: 11 سبتمبر 2026   المنفّذ: Super Z</w:t>
             </w:r>
           </w:p>
         </w:tc>
@@ -4818,7 +4818,7 @@
         <w:bidi w:val="1"/>
       </w:pPr>
       <w:r>
-        <w:t>[ ] مراجعة الصفحات والمسارات والـLayouts.</w:t>
+        <w:t>[x] مراجعة الصفحات والمسارات والـLayouts.</w:t>
       </w:r>
     </w:p>
     <w:p>
@@ -4828,7 +4828,7 @@
         <w:bidi w:val="1"/>
       </w:pPr>
       <w:r>
-        <w:t>[ ] حذف Components غير المستخدمة والنسخ المكررة.</w:t>
+        <w:t>[x] حذف Components غير المستخدمة والنسخ المكررة.</w:t>
       </w:r>
     </w:p>
     <w:p>
@@ -4838,7 +4838,7 @@
         <w:bidi w:val="1"/>
       </w:pPr>
       <w:r>
-        <w:t>[ ] توحيد Buttons, Inputs, Modals, Cards, Toasts, Empty States.</w:t>
+        <w:t>[x] توحيد Buttons, Inputs, Modals, Cards, Toasts, Empty States.</w:t>
       </w:r>
     </w:p>
     <w:p>
@@ -4848,7 +4848,7 @@
         <w:bidi w:val="1"/>
       </w:pPr>
       <w:r>
-        <w:t>[ ] تنظيف state management والـhooks.</w:t>
+        <w:t>[x] تنظيف state management والـhooks.</w:t>
       </w:r>
     </w:p>
     <w:p>
@@ -4858,7 +4858,7 @@
         <w:bidi w:val="1"/>
       </w:pPr>
       <w:r>
-        <w:t>[ ] مراجعة loading/error/empty states.</w:t>
+        <w:t>[x] مراجعة loading/error/empty states.</w:t>
       </w:r>
     </w:p>
     <w:p>
@@ -4868,7 +4868,7 @@
         <w:bidi w:val="1"/>
       </w:pPr>
       <w:r>
-        <w:t>[ ] مراجعة Responsive على الموبايل أولًا.</w:t>
+        <w:t>[x] مراجعة Responsive على الموبايل أولًا.</w:t>
       </w:r>
     </w:p>
     <w:p>
@@ -4878,7 +4878,7 @@
         <w:bidi w:val="1"/>
       </w:pPr>
       <w:r>
-        <w:t>[ ] توحيد أسماء الملفات والمسارات والـtypes.</w:t>
+        <w:t>[x] توحيد أسماء الملفات والمسارات والـtypes.</w:t>
       </w:r>
     </w:p>
     <w:p>
@@ -4898,7 +4898,7 @@
         <w:bidi w:val="1"/>
       </w:pPr>
       <w:r>
-        <w:t>[ ] مراجعة جميع الجداول والـcolumns والـindexes في Supabase.</w:t>
+        <w:t>[x] مراجعة جميع الجداول والـcolumns والـindexes في Supabase.</w:t>
       </w:r>
     </w:p>
     <w:p>
@@ -4908,7 +4908,7 @@
         <w:bidi w:val="1"/>
       </w:pPr>
       <w:r>
-        <w:t>[ ] حذف الجداول المهجورة أو غير المستخدمة.</w:t>
+        <w:t>[x] حذف الجداول المهجورة أو غير المستخدمة.</w:t>
       </w:r>
     </w:p>
     <w:p>
@@ -4918,7 +4918,7 @@
         <w:bidi w:val="1"/>
       </w:pPr>
       <w:r>
-        <w:t>[ ] توحيد العلاقات والمفاتيح.</w:t>
+        <w:t>[x] توحيد العلاقات والمفاتيح.</w:t>
       </w:r>
     </w:p>
     <w:p>
@@ -4928,7 +4928,7 @@
         <w:bidi w:val="1"/>
       </w:pPr>
       <w:r>
-        <w:t>[ ] مراجعة Server Actions / API Routes / Edge Functions.</w:t>
+        <w:t>[x] مراجعة Server Actions / API Routes / Edge Functions.</w:t>
       </w:r>
     </w:p>
     <w:p>
@@ -4938,7 +4938,7 @@
         <w:bidi w:val="1"/>
       </w:pPr>
       <w:r>
-        <w:t>[ ] منع أي أسرار أو مفاتيح سرية في Client code.</w:t>
+        <w:t>[x] منع أي أسرار أو مفاتيح سرية في Client code.</w:t>
       </w:r>
     </w:p>
     <w:p>
@@ -4948,7 +4948,7 @@
         <w:bidi w:val="1"/>
       </w:pPr>
       <w:r>
-        <w:t>[ ] إضافة validation مركزي للمدخلات الحساسة.</w:t>
+        <w:t>[x] إضافة validation مركزي للمدخلات الحساسة.</w:t>
       </w:r>
     </w:p>
     <w:p>
@@ -4968,7 +4968,7 @@
         <w:bidi w:val="1"/>
       </w:pPr>
       <w:r>
-        <w:t>[ ] Build ينجح بدون warnings حرجة أو imports ميتة معروفة.</w:t>
+        <w:t>[x] Build ينجح بدون warnings حرجة أو imports ميتة معروفة.</w:t>
       </w:r>
     </w:p>
     <w:p>
@@ -4978,7 +4978,7 @@
         <w:bidi w:val="1"/>
       </w:pPr>
       <w:r>
-        <w:t>[ ] لا توجد Features مكسورة في الرحلات الأساسية.</w:t>
+        <w:t>[x] لا توجد Features مكسورة في الرحلات الأساسية.</w:t>
       </w:r>
     </w:p>
     <w:p>
@@ -4988,7 +4988,7 @@
         <w:bidi w:val="1"/>
       </w:pPr>
       <w:r>
-        <w:t>[ ] قاعدة البيانات مفهومة ومُوثقة.</w:t>
+        <w:t>[x] قاعدة البيانات مفهومة ومُوثقة.</w:t>
       </w:r>
     </w:p>
     <w:p>

</xml_diff>

<commit_message>
phase-2 complete: Awj identity — rebrand 70 user-visible RiseOS strings to أوج + awj.life product title; new «sun at zenith» logo/icons (svg+192/512 png); unified status tokens (success/warning/info light+dark, token-based pills); unified navigation via lib/module-labels (fixes dashboard label drift); single toast system (sonner only, legacy toast deleted); logout confirmation dialog (owner board note); sw.js rebrand + cache bump awj-v4; README rebrand+accuracy; DESIGN.md design-system reference. Build ✓ TSC ✓. Mark phase 2 done in plan (card + 8 tasks + 3 DoD + board row 03 green + dates), regenerate marked PDF
</commit_message>
<xml_diff>
--- a/docs/Awj_Development_and_Launch_Plan.docx
+++ b/docs/Awj_Development_and_Launch_Plan.docx
@@ -1155,6 +1155,7 @@
               <w:right w:type="dxa" w:w="100"/>
             </w:tcMar>
             <w:vAlign w:val="center"/>
+            <w:shd w:val="clear" w:color="auto" w:fill="E8F5E9"/>
           </w:tcPr>
           <w:p>
             <w:pPr>
@@ -1165,11 +1166,13 @@
             <w:r>
               <w:rPr>
                 <w:rFonts w:ascii="Arial" w:hAnsi="Arial" w:eastAsia="Arial"/>
+                <w:b/>
+                <w:bCs/>
                 <w:sz w:val="18"/>
                 <w:szCs w:val="18"/>
-                <w:color w:val="7F7F7F"/>
+                <w:color w:val="2E7D32"/>
               </w:rPr>
-              <w:t xml:space="preserve">لم تبدأ</w:t>
+              <w:t xml:space="preserve">منجزة</w:t>
             </w:r>
           </w:p>
         </w:tc>
@@ -1196,7 +1199,7 @@
                 <w:sz w:val="18"/>
                 <w:szCs w:val="18"/>
               </w:rPr>
-              <w:t xml:space="preserve"/>
+              <w:t xml:space="preserve">2026-09-11</w:t>
             </w:r>
           </w:p>
         </w:tc>
@@ -1223,7 +1226,7 @@
                 <w:sz w:val="18"/>
                 <w:szCs w:val="18"/>
               </w:rPr>
-              <w:t xml:space="preserve"/>
+              <w:t xml:space="preserve">2026-09-11</w:t>
             </w:r>
           </w:p>
         </w:tc>
@@ -1251,7 +1254,7 @@
                 <w:szCs w:val="16"/>
                 <w:color w:val="595959"/>
               </w:rPr>
-              <w:t xml:space="preserve">أصلح زر الخروج الفوري ضمن هذه المرحلة</w:t>
+              <w:t xml:space="preserve">منجز كاملًا: هوية أوج (70 موضعًا) + awj.life + شعار «الشمس في أوجها» + توكنز حالات موحدة + Navigation/Toast موحد + زر الخروج بتأكيد — الأدلة: docs/phase-2/DESIGN.md</w:t>
             </w:r>
           </w:p>
         </w:tc>
@@ -5047,7 +5050,7 @@
                 <w:sz w:val="20"/>
                 <w:szCs w:val="20"/>
               </w:rPr>
-              <w:t xml:space="preserve">بطاقة متابعة — المرحلة الثانية (الترتيب 03/18):   [ ] لم تبدأ    [ ] قيد التنفيذ    [ ] منجزة</w:t>
+              <w:t xml:space="preserve">بطاقة متابعة — المرحلة الثانية (الترتيب 03/18):   [ ] لم تبدأ    [ ] قيد التنفيذ    [x] منجزة</w:t>
             </w:r>
           </w:p>
           <w:p>
@@ -5063,7 +5066,7 @@
                 <w:szCs w:val="18"/>
                 <w:color w:val="404040"/>
               </w:rPr>
-              <w:t xml:space="preserve">تاريخ البدء: ......................   تاريخ الإنجاز: ......................   المنفّذ: ......................</w:t>
+              <w:t xml:space="preserve">تاريخ البدء: 11 سبتمبر 2026   تاريخ الإنجاز: 11 سبتمبر 2026   المنفّذ: Super Z</w:t>
             </w:r>
           </w:p>
         </w:tc>
@@ -5095,7 +5098,7 @@
         <w:bidi w:val="1"/>
       </w:pPr>
       <w:r>
-        <w:t>[ ] استبدال Rise OS بالهوية النصية أوج في كل الأماكن.</w:t>
+        <w:t>[x] استبدال Rise OS بالهوية النصية أوج في كل الأماكن.</w:t>
       </w:r>
     </w:p>
     <w:p>
@@ -5105,7 +5108,7 @@
         <w:bidi w:val="1"/>
       </w:pPr>
       <w:r>
-        <w:t>[ ] تثبيت awj.life كعنوان المنتج عند الجاهزية.</w:t>
+        <w:t>[x] تثبيت awj.life كعنوان المنتج عند الجاهزية.</w:t>
       </w:r>
     </w:p>
     <w:p>
@@ -5115,7 +5118,7 @@
         <w:bidi w:val="1"/>
       </w:pPr>
       <w:r>
-        <w:t>[ ] اعتماد Logo/Favicon أساسيين.</w:t>
+        <w:t>[x] اعتماد Logo/Favicon أساسيين.</w:t>
       </w:r>
     </w:p>
     <w:p>
@@ -5125,7 +5128,7 @@
         <w:bidi w:val="1"/>
       </w:pPr>
       <w:r>
-        <w:t>[ ] تثبيت Typography وSpacing وRadius وShadow وBreakpoints.</w:t>
+        <w:t>[x] تثبيت Typography وSpacing وRadius وShadow وBreakpoints.</w:t>
       </w:r>
     </w:p>
     <w:p>
@@ -5135,7 +5138,7 @@
         <w:bidi w:val="1"/>
       </w:pPr>
       <w:r>
-        <w:t>[ ] إنشاء Design Tokens للألوان والأحجام.</w:t>
+        <w:t>[x] إنشاء Design Tokens للألوان والأحجام.</w:t>
       </w:r>
     </w:p>
     <w:p>
@@ -5145,7 +5148,7 @@
         <w:bidi w:val="1"/>
       </w:pPr>
       <w:r>
-        <w:t>[ ] توحيد حالات النجاح/التحذير/الخطأ/المعلومات.</w:t>
+        <w:t>[x] توحيد حالات النجاح/التحذير/الخطأ/المعلومات.</w:t>
       </w:r>
     </w:p>
     <w:p>
@@ -5155,7 +5158,7 @@
         <w:bidi w:val="1"/>
       </w:pPr>
       <w:r>
-        <w:t>[ ] توحيد Navigation وDashboard shell.</w:t>
+        <w:t>[x] توحيد Navigation وDashboard shell.</w:t>
       </w:r>
     </w:p>
     <w:p>
@@ -5165,7 +5168,7 @@
         <w:bidi w:val="1"/>
       </w:pPr>
       <w:r>
-        <w:t>[ ] تجهيز Dark/Light behavior حسب التصميم الحالي إن كان موجودًا، بدون إعادة تصميم شامل غير ضروري.</w:t>
+        <w:t>[x] تجهيز Dark/Light behavior حسب التصميم الحالي إن كان موجودًا، بدون إعادة تصميم شامل غير ضروري.</w:t>
       </w:r>
     </w:p>
     <w:p>
@@ -5185,7 +5188,7 @@
         <w:bidi w:val="1"/>
       </w:pPr>
       <w:r>
-        <w:t>[ ] كل صفحات التطبيق تستخدم نفس المكونات الأساسية.</w:t>
+        <w:t>[x] كل صفحات التطبيق تستخدم نفس المكونات الأساسية.</w:t>
       </w:r>
     </w:p>
     <w:p>
@@ -5195,7 +5198,7 @@
         <w:bidi w:val="1"/>
       </w:pPr>
       <w:r>
-        <w:t>[ ] لا توجد ألوان/مسافات عشوائية متكررة في الكود.</w:t>
+        <w:t>[x] لا توجد ألوان/مسافات عشوائية متكررة في الكود.</w:t>
       </w:r>
     </w:p>
     <w:p>
@@ -5205,7 +5208,7 @@
         <w:bidi w:val="1"/>
       </w:pPr>
       <w:r>
-        <w:t>[ ] الهوية أصبحت أوج من الواجهة حتى رسائل النظام.</w:t>
+        <w:t>[x] الهوية أصبحت أوج من الواجهة حتى رسائل النظام.</w:t>
       </w:r>
     </w:p>
     <w:p>

</xml_diff>

<commit_message>
phase-3 marked done in plan: card [x] منجزة + dates + 7 tasks + 3 security gate items checked; board row 04 green (2E7D32 + E8F5E9 fill) + dates 2026-09-11 + evidence note → docs/phase-3/AUTH.md; regenerate marked tasks PDF (24 pages, VLM-verified)
</commit_message>
<xml_diff>
--- a/docs/Awj_Development_and_Launch_Plan.docx
+++ b/docs/Awj_Development_and_Launch_Plan.docx
@@ -1327,6 +1327,7 @@
               <w:right w:type="dxa" w:w="100"/>
             </w:tcMar>
             <w:vAlign w:val="center"/>
+            <w:shd w:val="clear" w:color="auto" w:fill="E8F5E9"/>
           </w:tcPr>
           <w:p>
             <w:pPr>
@@ -1337,11 +1338,13 @@
             <w:r>
               <w:rPr>
                 <w:rFonts w:ascii="Arial" w:hAnsi="Arial" w:eastAsia="Arial"/>
+                <w:b/>
+                <w:bCs/>
                 <w:sz w:val="18"/>
                 <w:szCs w:val="18"/>
-                <w:color w:val="7F7F7F"/>
+                <w:color w:val="2E7D32"/>
               </w:rPr>
-              <w:t xml:space="preserve">لم تبدأ</w:t>
+              <w:t xml:space="preserve">منجزة</w:t>
             </w:r>
           </w:p>
         </w:tc>
@@ -1368,7 +1371,7 @@
                 <w:sz w:val="18"/>
                 <w:szCs w:val="18"/>
               </w:rPr>
-              <w:t xml:space="preserve"/>
+              <w:t xml:space="preserve">2026-09-11</w:t>
             </w:r>
           </w:p>
         </w:tc>
@@ -1395,7 +1398,7 @@
                 <w:sz w:val="18"/>
                 <w:szCs w:val="18"/>
               </w:rPr>
-              <w:t xml:space="preserve"/>
+              <w:t xml:space="preserve">2026-09-11</w:t>
             </w:r>
           </w:p>
         </w:tc>
@@ -1423,7 +1426,7 @@
                 <w:szCs w:val="16"/>
                 <w:color w:val="595959"/>
               </w:rPr>
-              <w:t xml:space="preserve">البنية موجودة ومجرّبة (RLS + Rate Limit + CSRF) — استخدم تقرير QA كخط أساس</w:t>
+              <w:t xml:space="preserve">منجز كاملًا: استعادة كلمة المرور (بريد+رابط+صفحة) + تغييرها من الإعدادات + خروج شامل من كل الأجهزة + حذف الحساب نهائيًا + user_subscriptions محمية من العميل + إغلاق ثغرة تصعيد الأدمن (migration 024) — الأدلة: docs/phase-3/AUTH.md</w:t>
             </w:r>
           </w:p>
         </w:tc>
@@ -5267,7 +5270,7 @@
                 <w:sz w:val="20"/>
                 <w:szCs w:val="20"/>
               </w:rPr>
-              <w:t xml:space="preserve">بطاقة متابعة — المرحلة الثالثة (الترتيب 04/18):   [ ] لم تبدأ    [ ] قيد التنفيذ    [ ] منجزة</w:t>
+              <w:t xml:space="preserve">بطاقة متابعة — المرحلة الثالثة (الترتيب 04/18):   [ ] لم تبدأ    [ ] قيد التنفيذ    [x] منجزة</w:t>
             </w:r>
           </w:p>
           <w:p>
@@ -5283,7 +5286,7 @@
                 <w:szCs w:val="18"/>
                 <w:color w:val="404040"/>
               </w:rPr>
-              <w:t xml:space="preserve">تاريخ البدء: ......................   تاريخ الإنجاز: ......................   المنفّذ: ......................</w:t>
+              <w:t xml:space="preserve">تاريخ البدء: 11 سبتمبر 2026   تاريخ الإنجاز: 11 سبتمبر 2026   المنفّذ: Super Z</w:t>
             </w:r>
           </w:p>
         </w:tc>
@@ -5315,7 +5318,7 @@
         <w:bidi w:val="1"/>
       </w:pPr>
       <w:r>
-        <w:t>[ ] مراجعة Sign up / Sign in / Sign out / Reset Password.</w:t>
+        <w:t>[x] مراجعة Sign up / Sign in / Sign out / Reset Password.</w:t>
       </w:r>
     </w:p>
     <w:p>
@@ -5325,7 +5328,7 @@
         <w:bidi w:val="1"/>
       </w:pPr>
       <w:r>
-        <w:t>[ ] تثبيت user profile في جدول منفصل عن auth users عند الحاجة.</w:t>
+        <w:t>[x] تثبيت user profile في جدول منفصل عن auth users عند الحاجة.</w:t>
       </w:r>
     </w:p>
     <w:p>
@@ -5335,7 +5338,7 @@
         <w:bidi w:val="1"/>
       </w:pPr>
       <w:r>
-        <w:t>[ ] حفظ plan/status بطريقة لا يمكن للمستخدم تعديلها من Client.</w:t>
+        <w:t>[x] حفظ plan/status بطريقة لا يمكن للمستخدم تعديلها من Client.</w:t>
       </w:r>
     </w:p>
     <w:p>
@@ -5345,7 +5348,7 @@
         <w:bidi w:val="1"/>
       </w:pPr>
       <w:r>
-        <w:t>[ ] إضافة account settings.</w:t>
+        <w:t>[x] إضافة account settings.</w:t>
       </w:r>
     </w:p>
     <w:p>
@@ -5355,7 +5358,7 @@
         <w:bidi w:val="1"/>
       </w:pPr>
       <w:r>
-        <w:t>[ ] إضافة حذف الحساب وخروج جميع الجلسات عند الحاجة.</w:t>
+        <w:t>[x] إضافة حذف الحساب وخروج جميع الجلسات عند الحاجة.</w:t>
       </w:r>
     </w:p>
     <w:p>
@@ -5365,7 +5368,7 @@
         <w:bidi w:val="1"/>
       </w:pPr>
       <w:r>
-        <w:t>[ ] ضبط RLS بحيث المستخدم يقرأ/يعدل بياناته فقط.</w:t>
+        <w:t>[x] ضبط RLS بحيث المستخدم يقرأ/يعدل بياناته فقط.</w:t>
       </w:r>
     </w:p>
     <w:p>
@@ -5375,7 +5378,7 @@
         <w:bidi w:val="1"/>
       </w:pPr>
       <w:r>
-        <w:t>[ ] مراجعة صلاحيات Admin منفصلة عن المستخدم العادي.</w:t>
+        <w:t>[x] مراجعة صلاحيات Admin منفصلة عن المستخدم العادي.</w:t>
       </w:r>
     </w:p>
     <w:p>
@@ -5395,7 +5398,7 @@
         <w:bidi w:val="1"/>
       </w:pPr>
       <w:r>
-        <w:t>[ ] تجربة مستخدم A لقراءة/تعديل بيانات مستخدم B تفشل دائمًا.</w:t>
+        <w:t>[x] تجربة مستخدم A لقراءة/تعديل بيانات مستخدم B تفشل دائمًا.</w:t>
       </w:r>
     </w:p>
     <w:p>
@@ -5405,7 +5408,7 @@
         <w:bidi w:val="1"/>
       </w:pPr>
       <w:r>
-        <w:t>[ ] لا يمكن رفع الخطة من DevTools أو تعديل subscription/status من Client.</w:t>
+        <w:t>[x] لا يمكن رفع الخطة من DevTools أو تعديل subscription/status من Client.</w:t>
       </w:r>
     </w:p>
     <w:p>
@@ -5415,7 +5418,7 @@
         <w:bidi w:val="1"/>
       </w:pPr>
       <w:r>
-        <w:t>[ ] كل endpoint حساس يتحقق من session وauthorization server-side.</w:t>
+        <w:t>[x] كل endpoint حساس يتحقق من session وauthorization server-side.</w:t>
       </w:r>
     </w:p>
     <w:p>

</xml_diff>

<commit_message>
feat(phase-10b): Supabase Edge Functions — خادم MCP توأم + مرسل Web Push على Deno
- supabase/functions/mcp: خادم MCP كامل على Edge (JSON-RPC 2.0، 8 أدوات،
  مصادقة rise_ بتجزئة SHA-256، بوابة max، حدود 30/د+10كتابة/د+60IP، تدقيق)
- supabase/functions/push-dispatch: مكنسة طابور البوش كل دقيقتين (pg_cron)
  بتشفير VAPID ES256 + RFC 8291 aes128gcm أصيل عبر Web Crypto بلا تبعيات
- _shared: عميل PostgREST خفيف + نواتا MCP/sweep قابلتان للاختبار بالحقن
- هجرة 033: push_dispatch_log + جدولة آمنة بسر Vault (idempotent)
- 35/35 اختبار Deno (فك تشفير من جهة المزود + مصفوفة إساءة + E2E حي)
- الإعدادات: نقطة Supabase بديلة في دليل الربط + tsconfig يستثني Deno
</commit_message>
<xml_diff>
--- a/docs/Awj_Development_and_Launch_Plan.docx
+++ b/docs/Awj_Development_and_Launch_Plan.docx
@@ -2427,6 +2427,11 @@
               <w:t>منجز كاملًا: خادم MCP حقيقي في /api/rise/mcp/call (JSON-RPC 2.0 عبر Streamable HTTP — initialize/tools/list/tools/call + batch + notifications) بـ8 أدوات قيّمة (list/create/complete_task، list_habits، check_in_habit، get_today_plan، get_productivity_score، create_journal_entry) — لا أي عملية حذف. الأمان: مصادقة Bearer rise_ حصرًا (رفض الكوكيز يقطع CSRF) + بوابة plan==max خادمية في كل طلب (fail-closed — نزول المستخدم من ماكس يوقف مفتاحه فورًا) + حدود 30 طلب/د و10 كتابة/د لكل مستخدم + zod strict لكل وسائط + Audit Log لكل كتابة ورفض خطة. واجهة إدارة المفتاح في الإعدادات (إنشاء/كشف لمرة واحدة/استبدال/إبطال + دليل ربط قابل للنسخ). اختبار 30/30 محليًا (بروتوكول + أدوات + 11 سيناريو إساءة + حدود) وإنتاجيًا: 401 بلا/بمفتاح مزيف، 403 PLAN_REQUIRED للمجاني، 405 لـGET، -32700 لـJSON تالف، CORS صحيح، وبطاقة القفل لغير ماكس بلا أي زر إنشاء — صفر أخطاء كونسول. commit 92d798d</w:t>
             </w:r>
           </w:p>
+          <w:p>
+            <w:r>
+              <w:t>ملحق 10-ب (نفس اليوم): الوظيفتان تعيشان الآن على Supabase نفسها — functions/v1/mcp (خادم MCP توأم على Deno: نفس الأدوات الثمانية والبوابة والحدود والتدقيق، مستقل عن Vercel) + functions/v1/push-dispatch (مكنسة طابور Web Push كل دقيقتين عبر pg_cron→pg_net، تشفير VAPID+RFC 8291 أصيل بلا تبعيات، إرسال الإشعارات حتى لو انهار مسار Vercel أو أُنشئت من لوحة الأدمن مباشرة). هجرة 033 (سجل push_dispatch_log + جدولة آمنة بسر Vault) + 35/35 اختبار Deno حي (دورة تشفير كاملة من جهة المزود + مصفوفة إساءة + E2E بعمليات حقيقية). واجهة الإعدادات تعرض النقطتين. نشر الوظيفتين بيد المالك: supabase functions deploy mcp/push-dispatch --no-verify-jwt ثم تشغيل الهجرة — موثق داخلها</w:t>
+            </w:r>
+          </w:p>
         </w:tc>
       </w:tr>
       <w:tr>

</xml_diff>